<commit_message>
Update report and setup docs
Refresh the project report and README to include the new setup notebook, document the restartable task flow, and correct the reported evaluation metrics and training summaries. This includes updating the AlpacaEval p-values, SFT/DPO narrative details, notebook ordering, and reproduction notes for the Kaggle setup path.
</commit_message>
<xml_diff>
--- a/25280065_PA2_report.docx
+++ b/25280065_PA2_report.docx
@@ -369,7 +369,7 @@
               <w:rPr>
                 <w:sz w:val="15"/>
               </w:rPr>
-              <w:t xml:space="preserve">(p = 0.007)</w:t>
+              <w:t xml:space="preserve">(p = 0.0065)</w:t>
             </w:r>
           </w:p>
         </w:tc>
@@ -6747,7 +6747,7 @@
         <w:t xml:space="preserve"> </w:t>
       </w:r>
       <w:r>
-        <w:t>from 1.3845 to 1.4082 at step 200 and then falls steadily to 1.3512. The rise coincides with warmup reaching the peak LR of 2e-5 at step 28 and staying near it, which briefly disturbs the pretrained distribution; cosine decay then lets the model settle. Train and validation loss both end near 1.35 (last logged train 1.346, validation 1.351), so there is</w:t>
+        <w:t xml:space="preserve">from 1.3845 to 1.4082 at step 200 and then falls steadily to 1.3512. The rise coincides with warmup reaching the peak LR of 2e-5 at step 28 and staying near it, which briefly disturbs the pretrained distribution; cosine decay then lets the model settle. Train and validation loss both end near 1.35 (last logged train 1.345, validation 1.351), so there is</w:t>
       </w:r>
       <w:r>
         <w:t xml:space="preserve"> </w:t>
@@ -6897,7 +6897,7 @@
         <w:t xml:space="preserve"> </w:t>
       </w:r>
       <w:r>
-        <w:t xml:space="preserve">learns slowly. Accuracy reaches 0.57 by step 50, then plateaus at 0.62–0.63 from step 150 onwards. Validation loss ends at 0.628, still close to ln 2, so the preference signal in single-turn HH pairs is weak and noisy at this LR.</w:t>
+        <w:t xml:space="preserve">learns slowly. Accuracy reaches 0.565 by step 50, then plateaus at 0.62–0.63 from step 150 onwards. Validation loss ends at 0.628, still close to ln 2, so the preference signal in single-turn HH pairs is weak and noisy at this LR.</w:t>
       </w:r>
     </w:p>
     <w:p>
@@ -7748,7 +7748,7 @@
               <w:rPr>
                 <w:sz w:val="15"/>
               </w:rPr>
-              <w:t xml:space="preserve">0.007</w:t>
+              <w:t xml:space="preserve">0.0065</w:t>
             </w:r>
           </w:p>
         </w:tc>
@@ -8676,7 +8676,7 @@
         <w:t xml:space="preserve"> </w:t>
       </w:r>
       <w:r>
-        <w:t xml:space="preserve">DPO wins 41.0% of decided pairs, 9 points below parity; it loses 43 more prompts than it wins (p = 0.007).</w:t>
+        <w:t xml:space="preserve">DPO wins 41.0% of decided pairs, 9 points below parity; it loses 43 more prompts than it wins (p = 0.0065).</w:t>
       </w:r>
     </w:p>
     <w:p>
@@ -9000,7 +9000,7 @@
         <w:t xml:space="preserve">extra hallucinations</w:t>
       </w:r>
       <w:r>
-        <w:t>. In example E2 below, the added paragraphs invent physics; in E3, the longer answer runs out of tokens mid-list.</w:t>
+        <w:t xml:space="preserve">. In example E2 below, the added paragraphs invent physics; in E3, the longer answer runs out of tokens mid-list.</w:t>
       </w:r>
     </w:p>
     <w:p>
@@ -9537,13 +9537,43 @@
         <w:pStyle w:val="FirstParagraph"/>
       </w:pPr>
       <w:r>
-        <w:t>The LoRA model is clearly more stylised: the style score rose in every category, and 9 of 12 answers open with an interjection (</w:t>
+        <w:t xml:space="preserve">The LoRA model is clearly more stylised: the style score rose in every category, and 9 of 12 answers open with an interjection (</w:t>
       </w:r>
       <w:r>
         <w:t xml:space="preserve">“</w:t>
       </w:r>
       <w:r>
-        <w:t>Oh no! …”, “Oh”, “Ah</w:t>
+        <w:t xml:space="preserve">Oh no! …</w:t>
+      </w:r>
+      <w:r>
+        <w:t xml:space="preserve">”</w:t>
+      </w:r>
+      <w:r>
+        <w:t xml:space="preserve">,</w:t>
+      </w:r>
+      <w:r>
+        <w:t xml:space="preserve"> </w:t>
+      </w:r>
+      <w:r>
+        <w:t xml:space="preserve">“</w:t>
+      </w:r>
+      <w:r>
+        <w:t xml:space="preserve">Oh</w:t>
+      </w:r>
+      <w:r>
+        <w:t xml:space="preserve">”</w:t>
+      </w:r>
+      <w:r>
+        <w:t xml:space="preserve">,</w:t>
+      </w:r>
+      <w:r>
+        <w:t xml:space="preserve"> </w:t>
+      </w:r>
+      <w:r>
+        <w:t xml:space="preserve">“</w:t>
+      </w:r>
+      <w:r>
+        <w:t xml:space="preserve">Ah</w:t>
       </w:r>
       <w:r>
         <w:t xml:space="preserve">”</w:t>
@@ -9736,7 +9766,7 @@
         <w:t xml:space="preserve"> </w:t>
       </w:r>
       <w:r>
-        <w:t>never appear, and 36 of the 37 style-score points come from</w:t>
+        <w:t xml:space="preserve">never appear, and 36 of the 37 style-score points come from</w:t>
       </w:r>
       <w:r>
         <w:t xml:space="preserve"> </w:t>
@@ -9798,12 +9828,12 @@
         </w:tblBorders>
       </w:tblPr>
       <w:tblGrid>
-        <w:gridCol w:w="718"/>
-        <w:gridCol w:w="2510"/>
-        <w:gridCol w:w="1692"/>
-        <w:gridCol w:w="2811"/>
-        <w:gridCol w:w="793"/>
-        <w:gridCol w:w="1791"/>
+        <w:gridCol w:w="713"/>
+        <w:gridCol w:w="2495"/>
+        <w:gridCol w:w="1682"/>
+        <w:gridCol w:w="2904"/>
+        <w:gridCol w:w="789"/>
+        <w:gridCol w:w="1732"/>
       </w:tblGrid>
       <w:tr>
         <w:trPr>
@@ -9811,7 +9841,7 @@
         </w:trPr>
         <w:tc>
           <w:tcPr>
-            <w:tcW w:type="dxa" w:w="718"/>
+            <w:tcW w:type="dxa" w:w="713"/>
             <w:shd w:val="clear" w:color="auto" w:fill="DCE6F2"/>
           </w:tcPr>
           <w:p>
@@ -9831,7 +9861,7 @@
         </w:tc>
         <w:tc>
           <w:tcPr>
-            <w:tcW w:type="dxa" w:w="2510"/>
+            <w:tcW w:type="dxa" w:w="2495"/>
             <w:shd w:val="clear" w:color="auto" w:fill="DCE6F2"/>
           </w:tcPr>
           <w:p>
@@ -9851,7 +9881,7 @@
         </w:tc>
         <w:tc>
           <w:tcPr>
-            <w:tcW w:type="dxa" w:w="1692"/>
+            <w:tcW w:type="dxa" w:w="1682"/>
             <w:shd w:val="clear" w:color="auto" w:fill="DCE6F2"/>
           </w:tcPr>
           <w:p>
@@ -9871,7 +9901,7 @@
         </w:tc>
         <w:tc>
           <w:tcPr>
-            <w:tcW w:type="dxa" w:w="2811"/>
+            <w:tcW w:type="dxa" w:w="2904"/>
             <w:shd w:val="clear" w:color="auto" w:fill="DCE6F2"/>
           </w:tcPr>
           <w:p>
@@ -9891,7 +9921,7 @@
         </w:tc>
         <w:tc>
           <w:tcPr>
-            <w:tcW w:type="dxa" w:w="793"/>
+            <w:tcW w:type="dxa" w:w="789"/>
             <w:shd w:val="clear" w:color="auto" w:fill="DCE6F2"/>
           </w:tcPr>
           <w:p>
@@ -9911,7 +9941,7 @@
         </w:tc>
         <w:tc>
           <w:tcPr>
-            <w:tcW w:type="dxa" w:w="1791"/>
+            <w:tcW w:type="dxa" w:w="1732"/>
             <w:shd w:val="clear" w:color="auto" w:fill="DCE6F2"/>
           </w:tcPr>
           <w:p>
@@ -9933,7 +9963,7 @@
       <w:tr>
         <w:tc>
           <w:tcPr>
-            <w:tcW w:type="dxa" w:w="718"/>
+            <w:tcW w:type="dxa" w:w="713"/>
           </w:tcPr>
           <w:p>
             <w:pPr>
@@ -9951,7 +9981,7 @@
         </w:tc>
         <w:tc>
           <w:tcPr>
-            <w:tcW w:type="dxa" w:w="2510"/>
+            <w:tcW w:type="dxa" w:w="2495"/>
           </w:tcPr>
           <w:p>
             <w:pPr>
@@ -10036,7 +10066,7 @@
         </w:tc>
         <w:tc>
           <w:tcPr>
-            <w:tcW w:type="dxa" w:w="1692"/>
+            <w:tcW w:type="dxa" w:w="1682"/>
           </w:tcPr>
           <w:p>
             <w:pPr>
@@ -10078,7 +10108,7 @@
         </w:tc>
         <w:tc>
           <w:tcPr>
-            <w:tcW w:type="dxa" w:w="2811"/>
+            <w:tcW w:type="dxa" w:w="2904"/>
           </w:tcPr>
           <w:p>
             <w:pPr>
@@ -10132,7 +10162,7 @@
         </w:tc>
         <w:tc>
           <w:tcPr>
-            <w:tcW w:type="dxa" w:w="793"/>
+            <w:tcW w:type="dxa" w:w="789"/>
           </w:tcPr>
           <w:p>
             <w:pPr>
@@ -10152,7 +10182,7 @@
         </w:tc>
         <w:tc>
           <w:tcPr>
-            <w:tcW w:type="dxa" w:w="1791"/>
+            <w:tcW w:type="dxa" w:w="1732"/>
           </w:tcPr>
           <w:p>
             <w:pPr>
@@ -10172,7 +10202,7 @@
       <w:tr>
         <w:tc>
           <w:tcPr>
-            <w:tcW w:type="dxa" w:w="718"/>
+            <w:tcW w:type="dxa" w:w="713"/>
           </w:tcPr>
           <w:p>
             <w:pPr>
@@ -10190,7 +10220,7 @@
         </w:tc>
         <w:tc>
           <w:tcPr>
-            <w:tcW w:type="dxa" w:w="2510"/>
+            <w:tcW w:type="dxa" w:w="2495"/>
           </w:tcPr>
           <w:p>
             <w:pPr>
@@ -10245,7 +10275,7 @@
         </w:tc>
         <w:tc>
           <w:tcPr>
-            <w:tcW w:type="dxa" w:w="1692"/>
+            <w:tcW w:type="dxa" w:w="1682"/>
           </w:tcPr>
           <w:p>
             <w:pPr>
@@ -10263,7 +10293,7 @@
         </w:tc>
         <w:tc>
           <w:tcPr>
-            <w:tcW w:type="dxa" w:w="2811"/>
+            <w:tcW w:type="dxa" w:w="2904"/>
           </w:tcPr>
           <w:p>
             <w:pPr>
@@ -10305,33 +10335,13 @@
               <w:rPr>
                 <w:sz w:val="15"/>
               </w:rPr>
-              <w:t>, then invents a lunar-eclipse explanation</w:t>
-            </w:r>
-            <w:r>
-              <w:rPr>
-                <w:sz w:val="15"/>
-              </w:rPr>
-            </w:r>
-            <w:r>
-              <w:rPr>
-                <w:sz w:val="15"/>
-              </w:rPr>
-            </w:r>
-            <w:r>
-              <w:rPr>
-                <w:sz w:val="15"/>
-              </w:rPr>
-            </w:r>
-            <w:r>
-              <w:rPr>
-                <w:sz w:val="15"/>
-              </w:rPr>
-            </w:r>
-          </w:p>
-        </w:tc>
-        <w:tc>
-          <w:tcPr>
-            <w:tcW w:type="dxa" w:w="793"/>
+              <w:t xml:space="preserve">, then invents a lunar-eclipse explanation</w:t>
+            </w:r>
+          </w:p>
+        </w:tc>
+        <w:tc>
+          <w:tcPr>
+            <w:tcW w:type="dxa" w:w="789"/>
           </w:tcPr>
           <w:p>
             <w:pPr>
@@ -10351,19 +10361,19 @@
         </w:tc>
         <w:tc>
           <w:tcPr>
-            <w:tcW w:type="dxa" w:w="1791"/>
-          </w:tcPr>
-          <w:p>
-            <w:pPr>
-              <w:pStyle w:val="Compact"/>
-              <w:spacing w:before="0" w:after="0" w:line="240" w:lineRule="auto"/>
-              <w:jc w:val="left"/>
-            </w:pPr>
-            <w:r>
-              <w:rPr>
-                <w:sz w:val="15"/>
-              </w:rPr>
-              <w:t>Regression: verbosity plus hallucination</w:t>
+            <w:tcW w:type="dxa" w:w="1732"/>
+          </w:tcPr>
+          <w:p>
+            <w:pPr>
+              <w:pStyle w:val="Compact"/>
+              <w:spacing w:before="0" w:after="0" w:line="240" w:lineRule="auto"/>
+              <w:jc w:val="left"/>
+            </w:pPr>
+            <w:r>
+              <w:rPr>
+                <w:sz w:val="15"/>
+              </w:rPr>
+              <w:t xml:space="preserve">Regression: verbosity plus hallucination</w:t>
             </w:r>
           </w:p>
         </w:tc>
@@ -10371,7 +10381,7 @@
       <w:tr>
         <w:tc>
           <w:tcPr>
-            <w:tcW w:type="dxa" w:w="718"/>
+            <w:tcW w:type="dxa" w:w="713"/>
           </w:tcPr>
           <w:p>
             <w:pPr>
@@ -10389,7 +10399,7 @@
         </w:tc>
         <w:tc>
           <w:tcPr>
-            <w:tcW w:type="dxa" w:w="2510"/>
+            <w:tcW w:type="dxa" w:w="2495"/>
           </w:tcPr>
           <w:p>
             <w:pPr>
@@ -10420,7 +10430,7 @@
         </w:tc>
         <w:tc>
           <w:tcPr>
-            <w:tcW w:type="dxa" w:w="1692"/>
+            <w:tcW w:type="dxa" w:w="1682"/>
           </w:tcPr>
           <w:p>
             <w:pPr>
@@ -10438,7 +10448,7 @@
         </w:tc>
         <w:tc>
           <w:tcPr>
-            <w:tcW w:type="dxa" w:w="2811"/>
+            <w:tcW w:type="dxa" w:w="2904"/>
           </w:tcPr>
           <w:p>
             <w:pPr>
@@ -10510,16 +10520,43 @@
               <w:rPr>
                 <w:sz w:val="15"/>
               </w:rPr>
-              <w:t>”, cut off mid-sentence (“Adding frozen fruit, spinach, and other ingredients into</w:t>
-            </w:r>
-            <w:r>
-              <w:t>”)</w:t>
-            </w:r>
-          </w:p>
-        </w:tc>
-        <w:tc>
-          <w:tcPr>
-            <w:tcW w:type="dxa" w:w="793"/>
+              <w:t xml:space="preserve">”</w:t>
+            </w:r>
+            <w:r>
+              <w:rPr>
+                <w:sz w:val="15"/>
+              </w:rPr>
+              <w:t xml:space="preserve">, cut off mid-sentence (</w:t>
+            </w:r>
+            <w:r>
+              <w:rPr>
+                <w:sz w:val="15"/>
+              </w:rPr>
+              <w:t xml:space="preserve">“</w:t>
+            </w:r>
+            <w:r>
+              <w:rPr>
+                <w:sz w:val="15"/>
+              </w:rPr>
+              <w:t xml:space="preserve">Adding frozen fruit, spinach, and other ingredients into</w:t>
+            </w:r>
+            <w:r>
+              <w:rPr>
+                <w:sz w:val="15"/>
+              </w:rPr>
+              <w:t xml:space="preserve">”</w:t>
+            </w:r>
+            <w:r>
+              <w:rPr>
+                <w:sz w:val="15"/>
+              </w:rPr>
+              <w:t xml:space="preserve">)</w:t>
+            </w:r>
+          </w:p>
+        </w:tc>
+        <w:tc>
+          <w:tcPr>
+            <w:tcW w:type="dxa" w:w="789"/>
           </w:tcPr>
           <w:p>
             <w:pPr>
@@ -10539,19 +10576,19 @@
         </w:tc>
         <w:tc>
           <w:tcPr>
-            <w:tcW w:type="dxa" w:w="1791"/>
-          </w:tcPr>
-          <w:p>
-            <w:pPr>
-              <w:pStyle w:val="Compact"/>
-              <w:spacing w:before="0" w:after="0" w:line="240" w:lineRule="auto"/>
-              <w:jc w:val="left"/>
-            </w:pPr>
-            <w:r>
-              <w:rPr>
-                <w:sz w:val="15"/>
-              </w:rPr>
-              <w:t>Regression: longer, less on-task, truncated</w:t>
+            <w:tcW w:type="dxa" w:w="1732"/>
+          </w:tcPr>
+          <w:p>
+            <w:pPr>
+              <w:pStyle w:val="Compact"/>
+              <w:spacing w:before="0" w:after="0" w:line="240" w:lineRule="auto"/>
+              <w:jc w:val="left"/>
+            </w:pPr>
+            <w:r>
+              <w:rPr>
+                <w:sz w:val="15"/>
+              </w:rPr>
+              <w:t xml:space="preserve">Regression: longer, less on-task, truncated</w:t>
             </w:r>
           </w:p>
         </w:tc>
@@ -10559,7 +10596,7 @@
       <w:tr>
         <w:tc>
           <w:tcPr>
-            <w:tcW w:type="dxa" w:w="718"/>
+            <w:tcW w:type="dxa" w:w="713"/>
           </w:tcPr>
           <w:p>
             <w:pPr>
@@ -10577,7 +10614,7 @@
         </w:tc>
         <w:tc>
           <w:tcPr>
-            <w:tcW w:type="dxa" w:w="2510"/>
+            <w:tcW w:type="dxa" w:w="2495"/>
           </w:tcPr>
           <w:p>
             <w:pPr>
@@ -10632,7 +10669,7 @@
         </w:tc>
         <w:tc>
           <w:tcPr>
-            <w:tcW w:type="dxa" w:w="1692"/>
+            <w:tcW w:type="dxa" w:w="1682"/>
           </w:tcPr>
           <w:p>
             <w:pPr>
@@ -10662,7 +10699,7 @@
         </w:tc>
         <w:tc>
           <w:tcPr>
-            <w:tcW w:type="dxa" w:w="2811"/>
+            <w:tcW w:type="dxa" w:w="2904"/>
           </w:tcPr>
           <w:p>
             <w:pPr>
@@ -10680,7 +10717,7 @@
         </w:tc>
         <w:tc>
           <w:tcPr>
-            <w:tcW w:type="dxa" w:w="793"/>
+            <w:tcW w:type="dxa" w:w="789"/>
           </w:tcPr>
           <w:p>
             <w:pPr>
@@ -10700,7 +10737,7 @@
         </w:tc>
         <w:tc>
           <w:tcPr>
-            <w:tcW w:type="dxa" w:w="1791"/>
+            <w:tcW w:type="dxa" w:w="1732"/>
           </w:tcPr>
           <w:p>
             <w:pPr>
@@ -10720,7 +10757,7 @@
       <w:tr>
         <w:tc>
           <w:tcPr>
-            <w:tcW w:type="dxa" w:w="718"/>
+            <w:tcW w:type="dxa" w:w="713"/>
           </w:tcPr>
           <w:p>
             <w:pPr>
@@ -10738,7 +10775,7 @@
         </w:tc>
         <w:tc>
           <w:tcPr>
-            <w:tcW w:type="dxa" w:w="2510"/>
+            <w:tcW w:type="dxa" w:w="2495"/>
           </w:tcPr>
           <w:p>
             <w:pPr>
@@ -10769,7 +10806,7 @@
         </w:tc>
         <w:tc>
           <w:tcPr>
-            <w:tcW w:type="dxa" w:w="1692"/>
+            <w:tcW w:type="dxa" w:w="1682"/>
           </w:tcPr>
           <w:p>
             <w:pPr>
@@ -10787,7 +10824,7 @@
         </w:tc>
         <w:tc>
           <w:tcPr>
-            <w:tcW w:type="dxa" w:w="2811"/>
+            <w:tcW w:type="dxa" w:w="2904"/>
           </w:tcPr>
           <w:p>
             <w:pPr>
@@ -10805,7 +10842,7 @@
         </w:tc>
         <w:tc>
           <w:tcPr>
-            <w:tcW w:type="dxa" w:w="793"/>
+            <w:tcW w:type="dxa" w:w="789"/>
           </w:tcPr>
           <w:p>
             <w:pPr>
@@ -10825,7 +10862,7 @@
         </w:tc>
         <w:tc>
           <w:tcPr>
-            <w:tcW w:type="dxa" w:w="1791"/>
+            <w:tcW w:type="dxa" w:w="1732"/>
           </w:tcPr>
           <w:p>
             <w:pPr>
@@ -10845,7 +10882,7 @@
       <w:tr>
         <w:tc>
           <w:tcPr>
-            <w:tcW w:type="dxa" w:w="718"/>
+            <w:tcW w:type="dxa" w:w="713"/>
           </w:tcPr>
           <w:p>
             <w:pPr>
@@ -10863,7 +10900,7 @@
         </w:tc>
         <w:tc>
           <w:tcPr>
-            <w:tcW w:type="dxa" w:w="2510"/>
+            <w:tcW w:type="dxa" w:w="2495"/>
           </w:tcPr>
           <w:p>
             <w:pPr>
@@ -10942,7 +10979,7 @@
         </w:tc>
         <w:tc>
           <w:tcPr>
-            <w:tcW w:type="dxa" w:w="1692"/>
+            <w:tcW w:type="dxa" w:w="1682"/>
           </w:tcPr>
           <w:p>
             <w:pPr>
@@ -10960,7 +10997,7 @@
         </w:tc>
         <w:tc>
           <w:tcPr>
-            <w:tcW w:type="dxa" w:w="2811"/>
+            <w:tcW w:type="dxa" w:w="2904"/>
           </w:tcPr>
           <w:p>
             <w:pPr>
@@ -11002,7 +11039,7 @@
         </w:tc>
         <w:tc>
           <w:tcPr>
-            <w:tcW w:type="dxa" w:w="793"/>
+            <w:tcW w:type="dxa" w:w="789"/>
           </w:tcPr>
           <w:p>
             <w:pPr>
@@ -11022,7 +11059,7 @@
         </w:tc>
         <w:tc>
           <w:tcPr>
-            <w:tcW w:type="dxa" w:w="1791"/>
+            <w:tcW w:type="dxa" w:w="1732"/>
           </w:tcPr>
           <w:p>
             <w:pPr>
@@ -11042,7 +11079,7 @@
       <w:tr>
         <w:tc>
           <w:tcPr>
-            <w:tcW w:type="dxa" w:w="718"/>
+            <w:tcW w:type="dxa" w:w="713"/>
           </w:tcPr>
           <w:p>
             <w:pPr>
@@ -11060,7 +11097,7 @@
         </w:tc>
         <w:tc>
           <w:tcPr>
-            <w:tcW w:type="dxa" w:w="2510"/>
+            <w:tcW w:type="dxa" w:w="2495"/>
           </w:tcPr>
           <w:p>
             <w:pPr>
@@ -11091,7 +11128,7 @@
         </w:tc>
         <w:tc>
           <w:tcPr>
-            <w:tcW w:type="dxa" w:w="1692"/>
+            <w:tcW w:type="dxa" w:w="1682"/>
           </w:tcPr>
           <w:p>
             <w:pPr>
@@ -11133,7 +11170,7 @@
         </w:tc>
         <w:tc>
           <w:tcPr>
-            <w:tcW w:type="dxa" w:w="2811"/>
+            <w:tcW w:type="dxa" w:w="2904"/>
           </w:tcPr>
           <w:p>
             <w:pPr>
@@ -11187,7 +11224,7 @@
         </w:tc>
         <w:tc>
           <w:tcPr>
-            <w:tcW w:type="dxa" w:w="793"/>
+            <w:tcW w:type="dxa" w:w="789"/>
           </w:tcPr>
           <w:p>
             <w:pPr>
@@ -11207,7 +11244,7 @@
         </w:tc>
         <w:tc>
           <w:tcPr>
-            <w:tcW w:type="dxa" w:w="1791"/>
+            <w:tcW w:type="dxa" w:w="1732"/>
           </w:tcPr>
           <w:p>
             <w:pPr>
@@ -11759,6 +11796,31 @@
                 <w:rStyle w:val="VerbatimChar"/>
                 <w:sz w:val="15"/>
               </w:rPr>
+              <w:t>notebooks/25280065-qwen2-5-sft-dpo-alignment-01-setup.ipynb</w:t>
+            </w:r>
+            <w:r>
+              <w:rPr>
+                <w:sz w:val="15"/>
+              </w:rPr>
+              <w:t xml:space="preserve"> </w:t>
+            </w:r>
+            <w:r>
+              <w:rPr>
+                <w:sz w:val="15"/>
+              </w:rPr>
+              <w:t xml:space="preserve">→</w:t>
+            </w:r>
+            <w:r>
+              <w:rPr>
+                <w:sz w:val="15"/>
+              </w:rPr>
+              <w:t xml:space="preserve"> </w:t>
+            </w:r>
+            <w:r>
+              <w:rPr>
+                <w:rStyle w:val="VerbatimChar"/>
+                <w:sz w:val="15"/>
+              </w:rPr>
               <w:t xml:space="preserve">notebooks/25280065_02_baseline.ipynb</w:t>
             </w:r>
             <w:r>
@@ -13264,7 +13326,7 @@
         <w:t xml:space="preserve"> </w:t>
       </w:r>
       <w:r>
-        <w:t xml:space="preserve">and run the notebooks in order; each skips work whose outputs already exist.</w:t>
+        <w:t>and run the notebooks in order; the DPO, generation and judge notebooks skip work whose outputs already exist.</w:t>
       </w:r>
     </w:p>
     <w:p>

</xml_diff>